<commit_message>
pushing an update for the following modules
</commit_message>
<xml_diff>
--- a/module-4/Zwhite_assignment4.2.docx
+++ b/module-4/Zwhite_assignment4.2.docx
@@ -14,7 +14,27 @@
           <w:sz w:val="36"/>
           <w:szCs w:val="36"/>
         </w:rPr>
-        <w:t>CSD 325 – Module 4 Assignment</w:t>
+        <w:t>CSD 325</w:t>
+      </w:r>
+      <w:r>
+        <w:rPr>
+          <w:b/>
+          <w:bCs/>
+          <w:color w:val="1F3864"/>
+          <w:sz w:val="36"/>
+          <w:szCs w:val="36"/>
+        </w:rPr>
+        <w:t xml:space="preserve"> -</w:t>
+      </w:r>
+      <w:r>
+        <w:rPr>
+          <w:b/>
+          <w:bCs/>
+          <w:color w:val="1F3864"/>
+          <w:sz w:val="36"/>
+          <w:szCs w:val="36"/>
+        </w:rPr>
+        <w:t xml:space="preserve"> Module 4 Assignment</w:t>
       </w:r>
     </w:p>
     <w:p/>
@@ -31,7 +51,15 @@
         <w:jc w:val="center"/>
       </w:pPr>
       <w:r>
-        <w:t>Date: April 17, 2026   |   Class: CSD 325</w:t>
+        <w:t xml:space="preserve">Date: April 17, </w:t>
+      </w:r>
+      <w:proofErr w:type="gramStart"/>
+      <w:r>
+        <w:t>2026</w:t>
+      </w:r>
+      <w:proofErr w:type="gramEnd"/>
+      <w:r>
+        <w:t xml:space="preserve">   |   Class: CSD 325</w:t>
       </w:r>
     </w:p>
     <w:p/>
@@ -178,10 +206,12 @@
         <w:t xml:space="preserve">Added import sys for a clean program exit via </w:t>
       </w:r>
       <w:proofErr w:type="spellStart"/>
+      <w:proofErr w:type="gramStart"/>
       <w:r>
         <w:t>sys.exit</w:t>
       </w:r>
       <w:proofErr w:type="spellEnd"/>
+      <w:proofErr w:type="gramEnd"/>
       <w:r>
         <w:t>().</w:t>
       </w:r>
@@ -222,7 +252,15 @@
         <w:spacing w:line="480" w:lineRule="auto"/>
       </w:pPr>
       <w:r>
-        <w:t>Added a menu each iteration: H = Highs, L = Lows, E = Exit.</w:t>
+        <w:t xml:space="preserve">Added a </w:t>
+      </w:r>
+      <w:proofErr w:type="gramStart"/>
+      <w:r>
+        <w:t>menu</w:t>
+      </w:r>
+      <w:proofErr w:type="gramEnd"/>
+      <w:r>
+        <w:t xml:space="preserve"> each iteration: H = Highs, L = Lows, E = Exit.</w:t>
       </w:r>
     </w:p>
     <w:p>
@@ -235,7 +273,15 @@
         <w:spacing w:line="480" w:lineRule="auto"/>
       </w:pPr>
       <w:r>
-        <w:t>"Lows" option plots TMIN (row[6]) in blue with its own title.</w:t>
+        <w:t>"Lows" option plots TMIN (</w:t>
+      </w:r>
+      <w:proofErr w:type="gramStart"/>
+      <w:r>
+        <w:t>row[</w:t>
+      </w:r>
+      <w:proofErr w:type="gramEnd"/>
+      <w:r>
+        <w:t>6]) in blue with its own title.</w:t>
       </w:r>
     </w:p>
     <w:p>
@@ -251,10 +297,12 @@
         <w:t xml:space="preserve">"Exit" option prints a goodbye message then calls </w:t>
       </w:r>
       <w:proofErr w:type="spellStart"/>
+      <w:proofErr w:type="gramStart"/>
       <w:r>
         <w:t>sys.exit</w:t>
       </w:r>
       <w:proofErr w:type="spellEnd"/>
+      <w:proofErr w:type="gramEnd"/>
       <w:r>
         <w:t>(0).</w:t>
       </w:r>
@@ -336,14 +384,25 @@
       <w:pPr>
         <w:shd w:val="clear" w:color="auto" w:fill="F2F2F2"/>
       </w:pPr>
-      <w:r>
-        <w:rPr>
-          <w:rFonts w:ascii="Courier New" w:eastAsia="Courier New" w:hAnsi="Courier New" w:cs="Courier New"/>
-          <w:color w:val="1A1A2E"/>
-          <w:sz w:val="19"/>
-          <w:szCs w:val="19"/>
-        </w:rPr>
-        <w:t>Student : Zachary White</w:t>
+      <w:proofErr w:type="gramStart"/>
+      <w:r>
+        <w:rPr>
+          <w:rFonts w:ascii="Courier New" w:eastAsia="Courier New" w:hAnsi="Courier New" w:cs="Courier New"/>
+          <w:color w:val="1A1A2E"/>
+          <w:sz w:val="19"/>
+          <w:szCs w:val="19"/>
+        </w:rPr>
+        <w:t>Student :</w:t>
+      </w:r>
+      <w:proofErr w:type="gramEnd"/>
+      <w:r>
+        <w:rPr>
+          <w:rFonts w:ascii="Courier New" w:eastAsia="Courier New" w:hAnsi="Courier New" w:cs="Courier New"/>
+          <w:color w:val="1A1A2E"/>
+          <w:sz w:val="19"/>
+          <w:szCs w:val="19"/>
+        </w:rPr>
+        <w:t xml:space="preserve"> Zachary White</w:t>
       </w:r>
     </w:p>
     <w:p>
@@ -371,21 +430,61 @@
           <w:sz w:val="19"/>
           <w:szCs w:val="19"/>
         </w:rPr>
-        <w:t>Class   : CSD 325</w:t>
-      </w:r>
-    </w:p>
-    <w:p>
-      <w:pPr>
-        <w:shd w:val="clear" w:color="auto" w:fill="F2F2F2"/>
-      </w:pPr>
-      <w:r>
-        <w:rPr>
-          <w:rFonts w:ascii="Courier New" w:eastAsia="Courier New" w:hAnsi="Courier New" w:cs="Courier New"/>
-          <w:color w:val="1A1A2E"/>
-          <w:sz w:val="19"/>
-          <w:szCs w:val="19"/>
-        </w:rPr>
-        <w:t>Date    : 04/17/2026</w:t>
+        <w:t xml:space="preserve">Class </w:t>
+      </w:r>
+      <w:proofErr w:type="gramStart"/>
+      <w:r>
+        <w:rPr>
+          <w:rFonts w:ascii="Courier New" w:eastAsia="Courier New" w:hAnsi="Courier New" w:cs="Courier New"/>
+          <w:color w:val="1A1A2E"/>
+          <w:sz w:val="19"/>
+          <w:szCs w:val="19"/>
+        </w:rPr>
+        <w:t xml:space="preserve">  :</w:t>
+      </w:r>
+      <w:proofErr w:type="gramEnd"/>
+      <w:r>
+        <w:rPr>
+          <w:rFonts w:ascii="Courier New" w:eastAsia="Courier New" w:hAnsi="Courier New" w:cs="Courier New"/>
+          <w:color w:val="1A1A2E"/>
+          <w:sz w:val="19"/>
+          <w:szCs w:val="19"/>
+        </w:rPr>
+        <w:t xml:space="preserve"> CSD 325</w:t>
+      </w:r>
+    </w:p>
+    <w:p>
+      <w:pPr>
+        <w:shd w:val="clear" w:color="auto" w:fill="F2F2F2"/>
+      </w:pPr>
+      <w:r>
+        <w:rPr>
+          <w:rFonts w:ascii="Courier New" w:eastAsia="Courier New" w:hAnsi="Courier New" w:cs="Courier New"/>
+          <w:color w:val="1A1A2E"/>
+          <w:sz w:val="19"/>
+          <w:szCs w:val="19"/>
+        </w:rPr>
+        <w:t xml:space="preserve">Date  </w:t>
+      </w:r>
+      <w:proofErr w:type="gramStart"/>
+      <w:r>
+        <w:rPr>
+          <w:rFonts w:ascii="Courier New" w:eastAsia="Courier New" w:hAnsi="Courier New" w:cs="Courier New"/>
+          <w:color w:val="1A1A2E"/>
+          <w:sz w:val="19"/>
+          <w:szCs w:val="19"/>
+        </w:rPr>
+        <w:t xml:space="preserve">  :</w:t>
+      </w:r>
+      <w:proofErr w:type="gramEnd"/>
+      <w:r>
+        <w:rPr>
+          <w:rFonts w:ascii="Courier New" w:eastAsia="Courier New" w:hAnsi="Courier New" w:cs="Courier New"/>
+          <w:color w:val="1A1A2E"/>
+          <w:sz w:val="19"/>
+          <w:szCs w:val="19"/>
+        </w:rPr>
+        <w:t xml:space="preserve"> 04/17/2026</w:t>
       </w:r>
     </w:p>
     <w:p>
@@ -522,42 +621,75 @@
       <w:pPr>
         <w:shd w:val="clear" w:color="auto" w:fill="F2F2F2"/>
       </w:pPr>
-      <w:r>
-        <w:rPr>
-          <w:rFonts w:ascii="Courier New" w:eastAsia="Courier New" w:hAnsi="Courier New" w:cs="Courier New"/>
-          <w:color w:val="1A1A2E"/>
-          <w:sz w:val="19"/>
-          <w:szCs w:val="19"/>
-        </w:rPr>
-        <w:t>print("=" * 50)</w:t>
-      </w:r>
-    </w:p>
-    <w:p>
-      <w:pPr>
-        <w:shd w:val="clear" w:color="auto" w:fill="F2F2F2"/>
-      </w:pPr>
-      <w:r>
-        <w:rPr>
-          <w:rFonts w:ascii="Courier New" w:eastAsia="Courier New" w:hAnsi="Courier New" w:cs="Courier New"/>
-          <w:color w:val="1A1A2E"/>
-          <w:sz w:val="19"/>
-          <w:szCs w:val="19"/>
-        </w:rPr>
-        <w:t>print("   Sitka, AK Weather Viewer - 2018")</w:t>
-      </w:r>
-    </w:p>
-    <w:p>
-      <w:pPr>
-        <w:shd w:val="clear" w:color="auto" w:fill="F2F2F2"/>
-      </w:pPr>
-      <w:r>
-        <w:rPr>
-          <w:rFonts w:ascii="Courier New" w:eastAsia="Courier New" w:hAnsi="Courier New" w:cs="Courier New"/>
-          <w:color w:val="1A1A2E"/>
-          <w:sz w:val="19"/>
-          <w:szCs w:val="19"/>
-        </w:rPr>
-        <w:t>print("=" * 50)</w:t>
+      <w:proofErr w:type="gramStart"/>
+      <w:r>
+        <w:rPr>
+          <w:rFonts w:ascii="Courier New" w:eastAsia="Courier New" w:hAnsi="Courier New" w:cs="Courier New"/>
+          <w:color w:val="1A1A2E"/>
+          <w:sz w:val="19"/>
+          <w:szCs w:val="19"/>
+        </w:rPr>
+        <w:t>print(</w:t>
+      </w:r>
+      <w:proofErr w:type="gramEnd"/>
+      <w:r>
+        <w:rPr>
+          <w:rFonts w:ascii="Courier New" w:eastAsia="Courier New" w:hAnsi="Courier New" w:cs="Courier New"/>
+          <w:color w:val="1A1A2E"/>
+          <w:sz w:val="19"/>
+          <w:szCs w:val="19"/>
+        </w:rPr>
+        <w:t>"=" * 50)</w:t>
+      </w:r>
+    </w:p>
+    <w:p>
+      <w:pPr>
+        <w:shd w:val="clear" w:color="auto" w:fill="F2F2F2"/>
+      </w:pPr>
+      <w:proofErr w:type="gramStart"/>
+      <w:r>
+        <w:rPr>
+          <w:rFonts w:ascii="Courier New" w:eastAsia="Courier New" w:hAnsi="Courier New" w:cs="Courier New"/>
+          <w:color w:val="1A1A2E"/>
+          <w:sz w:val="19"/>
+          <w:szCs w:val="19"/>
+        </w:rPr>
+        <w:t>print(</w:t>
+      </w:r>
+      <w:proofErr w:type="gramEnd"/>
+      <w:r>
+        <w:rPr>
+          <w:rFonts w:ascii="Courier New" w:eastAsia="Courier New" w:hAnsi="Courier New" w:cs="Courier New"/>
+          <w:color w:val="1A1A2E"/>
+          <w:sz w:val="19"/>
+          <w:szCs w:val="19"/>
+        </w:rPr>
+        <w:t>"   Sitka, AK Weather Viewer - 2018")</w:t>
+      </w:r>
+    </w:p>
+    <w:p>
+      <w:pPr>
+        <w:shd w:val="clear" w:color="auto" w:fill="F2F2F2"/>
+      </w:pPr>
+      <w:proofErr w:type="gramStart"/>
+      <w:r>
+        <w:rPr>
+          <w:rFonts w:ascii="Courier New" w:eastAsia="Courier New" w:hAnsi="Courier New" w:cs="Courier New"/>
+          <w:color w:val="1A1A2E"/>
+          <w:sz w:val="19"/>
+          <w:szCs w:val="19"/>
+        </w:rPr>
+        <w:t>print(</w:t>
+      </w:r>
+      <w:proofErr w:type="gramEnd"/>
+      <w:r>
+        <w:rPr>
+          <w:rFonts w:ascii="Courier New" w:eastAsia="Courier New" w:hAnsi="Courier New" w:cs="Courier New"/>
+          <w:color w:val="1A1A2E"/>
+          <w:sz w:val="19"/>
+          <w:szCs w:val="19"/>
+        </w:rPr>
+        <w:t>"=" * 50)</w:t>
       </w:r>
     </w:p>
     <w:p>
@@ -590,68 +722,288 @@
           <w:sz w:val="19"/>
           <w:szCs w:val="19"/>
         </w:rPr>
-        <w:t xml:space="preserve">    print(" Please select an option:")</w:t>
-      </w:r>
-    </w:p>
-    <w:p>
-      <w:pPr>
-        <w:shd w:val="clear" w:color="auto" w:fill="F2F2F2"/>
-      </w:pPr>
-      <w:r>
-        <w:rPr>
-          <w:rFonts w:ascii="Courier New" w:eastAsia="Courier New" w:hAnsi="Courier New" w:cs="Courier New"/>
-          <w:color w:val="1A1A2E"/>
-          <w:sz w:val="19"/>
-          <w:szCs w:val="19"/>
-        </w:rPr>
-        <w:t xml:space="preserve">    print("  H - Highs  : View daily HIGH temperatures")</w:t>
-      </w:r>
-    </w:p>
-    <w:p>
-      <w:pPr>
-        <w:shd w:val="clear" w:color="auto" w:fill="F2F2F2"/>
-      </w:pPr>
-      <w:r>
-        <w:rPr>
-          <w:rFonts w:ascii="Courier New" w:eastAsia="Courier New" w:hAnsi="Courier New" w:cs="Courier New"/>
-          <w:color w:val="1A1A2E"/>
-          <w:sz w:val="19"/>
-          <w:szCs w:val="19"/>
-        </w:rPr>
-        <w:t xml:space="preserve">    print("  L - Lows   : View daily LOW  temperatures")</w:t>
-      </w:r>
-    </w:p>
-    <w:p>
-      <w:pPr>
-        <w:shd w:val="clear" w:color="auto" w:fill="F2F2F2"/>
-      </w:pPr>
-      <w:r>
-        <w:rPr>
-          <w:rFonts w:ascii="Courier New" w:eastAsia="Courier New" w:hAnsi="Courier New" w:cs="Courier New"/>
-          <w:color w:val="1A1A2E"/>
-          <w:sz w:val="19"/>
-          <w:szCs w:val="19"/>
-        </w:rPr>
-        <w:t xml:space="preserve">    print("  E - Exit   : Quit the program")</w:t>
-      </w:r>
-    </w:p>
-    <w:p>
-      <w:pPr>
-        <w:shd w:val="clear" w:color="auto" w:fill="F2F2F2"/>
-      </w:pPr>
-    </w:p>
-    <w:p>
-      <w:pPr>
-        <w:shd w:val="clear" w:color="auto" w:fill="F2F2F2"/>
-      </w:pPr>
-      <w:r>
-        <w:rPr>
-          <w:rFonts w:ascii="Courier New" w:eastAsia="Courier New" w:hAnsi="Courier New" w:cs="Courier New"/>
-          <w:color w:val="1A1A2E"/>
-          <w:sz w:val="19"/>
-          <w:szCs w:val="19"/>
-        </w:rPr>
-        <w:t xml:space="preserve">    choice = input(" Enter your choice (H / L / E): ").strip().upper()</w:t>
+        <w:t xml:space="preserve">    </w:t>
+      </w:r>
+      <w:proofErr w:type="gramStart"/>
+      <w:r>
+        <w:rPr>
+          <w:rFonts w:ascii="Courier New" w:eastAsia="Courier New" w:hAnsi="Courier New" w:cs="Courier New"/>
+          <w:color w:val="1A1A2E"/>
+          <w:sz w:val="19"/>
+          <w:szCs w:val="19"/>
+        </w:rPr>
+        <w:t>print(" Please</w:t>
+      </w:r>
+      <w:proofErr w:type="gramEnd"/>
+      <w:r>
+        <w:rPr>
+          <w:rFonts w:ascii="Courier New" w:eastAsia="Courier New" w:hAnsi="Courier New" w:cs="Courier New"/>
+          <w:color w:val="1A1A2E"/>
+          <w:sz w:val="19"/>
+          <w:szCs w:val="19"/>
+        </w:rPr>
+        <w:t xml:space="preserve"> select an option:")</w:t>
+      </w:r>
+    </w:p>
+    <w:p>
+      <w:pPr>
+        <w:shd w:val="clear" w:color="auto" w:fill="F2F2F2"/>
+      </w:pPr>
+      <w:r>
+        <w:rPr>
+          <w:rFonts w:ascii="Courier New" w:eastAsia="Courier New" w:hAnsi="Courier New" w:cs="Courier New"/>
+          <w:color w:val="1A1A2E"/>
+          <w:sz w:val="19"/>
+          <w:szCs w:val="19"/>
+        </w:rPr>
+        <w:t xml:space="preserve">    </w:t>
+      </w:r>
+      <w:proofErr w:type="gramStart"/>
+      <w:r>
+        <w:rPr>
+          <w:rFonts w:ascii="Courier New" w:eastAsia="Courier New" w:hAnsi="Courier New" w:cs="Courier New"/>
+          <w:color w:val="1A1A2E"/>
+          <w:sz w:val="19"/>
+          <w:szCs w:val="19"/>
+        </w:rPr>
+        <w:t>print("  H</w:t>
+      </w:r>
+      <w:proofErr w:type="gramEnd"/>
+      <w:r>
+        <w:rPr>
+          <w:rFonts w:ascii="Courier New" w:eastAsia="Courier New" w:hAnsi="Courier New" w:cs="Courier New"/>
+          <w:color w:val="1A1A2E"/>
+          <w:sz w:val="19"/>
+          <w:szCs w:val="19"/>
+        </w:rPr>
+        <w:t xml:space="preserve"> - </w:t>
+      </w:r>
+      <w:proofErr w:type="gramStart"/>
+      <w:r>
+        <w:rPr>
+          <w:rFonts w:ascii="Courier New" w:eastAsia="Courier New" w:hAnsi="Courier New" w:cs="Courier New"/>
+          <w:color w:val="1A1A2E"/>
+          <w:sz w:val="19"/>
+          <w:szCs w:val="19"/>
+        </w:rPr>
+        <w:t>Highs  :</w:t>
+      </w:r>
+      <w:proofErr w:type="gramEnd"/>
+      <w:r>
+        <w:rPr>
+          <w:rFonts w:ascii="Courier New" w:eastAsia="Courier New" w:hAnsi="Courier New" w:cs="Courier New"/>
+          <w:color w:val="1A1A2E"/>
+          <w:sz w:val="19"/>
+          <w:szCs w:val="19"/>
+        </w:rPr>
+        <w:t xml:space="preserve"> View daily HIGH temperatures")</w:t>
+      </w:r>
+    </w:p>
+    <w:p>
+      <w:pPr>
+        <w:shd w:val="clear" w:color="auto" w:fill="F2F2F2"/>
+      </w:pPr>
+      <w:r>
+        <w:rPr>
+          <w:rFonts w:ascii="Courier New" w:eastAsia="Courier New" w:hAnsi="Courier New" w:cs="Courier New"/>
+          <w:color w:val="1A1A2E"/>
+          <w:sz w:val="19"/>
+          <w:szCs w:val="19"/>
+        </w:rPr>
+        <w:t xml:space="preserve">    </w:t>
+      </w:r>
+      <w:proofErr w:type="gramStart"/>
+      <w:r>
+        <w:rPr>
+          <w:rFonts w:ascii="Courier New" w:eastAsia="Courier New" w:hAnsi="Courier New" w:cs="Courier New"/>
+          <w:color w:val="1A1A2E"/>
+          <w:sz w:val="19"/>
+          <w:szCs w:val="19"/>
+        </w:rPr>
+        <w:t>print("  L</w:t>
+      </w:r>
+      <w:proofErr w:type="gramEnd"/>
+      <w:r>
+        <w:rPr>
+          <w:rFonts w:ascii="Courier New" w:eastAsia="Courier New" w:hAnsi="Courier New" w:cs="Courier New"/>
+          <w:color w:val="1A1A2E"/>
+          <w:sz w:val="19"/>
+          <w:szCs w:val="19"/>
+        </w:rPr>
+        <w:t xml:space="preserve"> - Lows </w:t>
+      </w:r>
+      <w:proofErr w:type="gramStart"/>
+      <w:r>
+        <w:rPr>
+          <w:rFonts w:ascii="Courier New" w:eastAsia="Courier New" w:hAnsi="Courier New" w:cs="Courier New"/>
+          <w:color w:val="1A1A2E"/>
+          <w:sz w:val="19"/>
+          <w:szCs w:val="19"/>
+        </w:rPr>
+        <w:t xml:space="preserve">  :</w:t>
+      </w:r>
+      <w:proofErr w:type="gramEnd"/>
+      <w:r>
+        <w:rPr>
+          <w:rFonts w:ascii="Courier New" w:eastAsia="Courier New" w:hAnsi="Courier New" w:cs="Courier New"/>
+          <w:color w:val="1A1A2E"/>
+          <w:sz w:val="19"/>
+          <w:szCs w:val="19"/>
+        </w:rPr>
+        <w:t xml:space="preserve"> View daily </w:t>
+      </w:r>
+      <w:proofErr w:type="gramStart"/>
+      <w:r>
+        <w:rPr>
+          <w:rFonts w:ascii="Courier New" w:eastAsia="Courier New" w:hAnsi="Courier New" w:cs="Courier New"/>
+          <w:color w:val="1A1A2E"/>
+          <w:sz w:val="19"/>
+          <w:szCs w:val="19"/>
+        </w:rPr>
+        <w:t>LOW  temperatures</w:t>
+      </w:r>
+      <w:proofErr w:type="gramEnd"/>
+      <w:r>
+        <w:rPr>
+          <w:rFonts w:ascii="Courier New" w:eastAsia="Courier New" w:hAnsi="Courier New" w:cs="Courier New"/>
+          <w:color w:val="1A1A2E"/>
+          <w:sz w:val="19"/>
+          <w:szCs w:val="19"/>
+        </w:rPr>
+        <w:t>")</w:t>
+      </w:r>
+    </w:p>
+    <w:p>
+      <w:pPr>
+        <w:shd w:val="clear" w:color="auto" w:fill="F2F2F2"/>
+      </w:pPr>
+      <w:r>
+        <w:rPr>
+          <w:rFonts w:ascii="Courier New" w:eastAsia="Courier New" w:hAnsi="Courier New" w:cs="Courier New"/>
+          <w:color w:val="1A1A2E"/>
+          <w:sz w:val="19"/>
+          <w:szCs w:val="19"/>
+        </w:rPr>
+        <w:t xml:space="preserve">    </w:t>
+      </w:r>
+      <w:proofErr w:type="gramStart"/>
+      <w:r>
+        <w:rPr>
+          <w:rFonts w:ascii="Courier New" w:eastAsia="Courier New" w:hAnsi="Courier New" w:cs="Courier New"/>
+          <w:color w:val="1A1A2E"/>
+          <w:sz w:val="19"/>
+          <w:szCs w:val="19"/>
+        </w:rPr>
+        <w:t>print("  E</w:t>
+      </w:r>
+      <w:proofErr w:type="gramEnd"/>
+      <w:r>
+        <w:rPr>
+          <w:rFonts w:ascii="Courier New" w:eastAsia="Courier New" w:hAnsi="Courier New" w:cs="Courier New"/>
+          <w:color w:val="1A1A2E"/>
+          <w:sz w:val="19"/>
+          <w:szCs w:val="19"/>
+        </w:rPr>
+        <w:t xml:space="preserve"> - Exit </w:t>
+      </w:r>
+      <w:proofErr w:type="gramStart"/>
+      <w:r>
+        <w:rPr>
+          <w:rFonts w:ascii="Courier New" w:eastAsia="Courier New" w:hAnsi="Courier New" w:cs="Courier New"/>
+          <w:color w:val="1A1A2E"/>
+          <w:sz w:val="19"/>
+          <w:szCs w:val="19"/>
+        </w:rPr>
+        <w:t xml:space="preserve">  :</w:t>
+      </w:r>
+      <w:proofErr w:type="gramEnd"/>
+      <w:r>
+        <w:rPr>
+          <w:rFonts w:ascii="Courier New" w:eastAsia="Courier New" w:hAnsi="Courier New" w:cs="Courier New"/>
+          <w:color w:val="1A1A2E"/>
+          <w:sz w:val="19"/>
+          <w:szCs w:val="19"/>
+        </w:rPr>
+        <w:t xml:space="preserve"> Quit the program")</w:t>
+      </w:r>
+    </w:p>
+    <w:p>
+      <w:pPr>
+        <w:shd w:val="clear" w:color="auto" w:fill="F2F2F2"/>
+      </w:pPr>
+    </w:p>
+    <w:p>
+      <w:pPr>
+        <w:shd w:val="clear" w:color="auto" w:fill="F2F2F2"/>
+      </w:pPr>
+      <w:r>
+        <w:rPr>
+          <w:rFonts w:ascii="Courier New" w:eastAsia="Courier New" w:hAnsi="Courier New" w:cs="Courier New"/>
+          <w:color w:val="1A1A2E"/>
+          <w:sz w:val="19"/>
+          <w:szCs w:val="19"/>
+        </w:rPr>
+        <w:t xml:space="preserve">    choice = </w:t>
+      </w:r>
+      <w:proofErr w:type="gramStart"/>
+      <w:r>
+        <w:rPr>
+          <w:rFonts w:ascii="Courier New" w:eastAsia="Courier New" w:hAnsi="Courier New" w:cs="Courier New"/>
+          <w:color w:val="1A1A2E"/>
+          <w:sz w:val="19"/>
+          <w:szCs w:val="19"/>
+        </w:rPr>
+        <w:t>input(</w:t>
+      </w:r>
+      <w:proofErr w:type="gramEnd"/>
+      <w:r>
+        <w:rPr>
+          <w:rFonts w:ascii="Courier New" w:eastAsia="Courier New" w:hAnsi="Courier New" w:cs="Courier New"/>
+          <w:color w:val="1A1A2E"/>
+          <w:sz w:val="19"/>
+          <w:szCs w:val="19"/>
+        </w:rPr>
+        <w:t>" Enter your choice (H / L / E): "</w:t>
+      </w:r>
+      <w:proofErr w:type="gramStart"/>
+      <w:r>
+        <w:rPr>
+          <w:rFonts w:ascii="Courier New" w:eastAsia="Courier New" w:hAnsi="Courier New" w:cs="Courier New"/>
+          <w:color w:val="1A1A2E"/>
+          <w:sz w:val="19"/>
+          <w:szCs w:val="19"/>
+        </w:rPr>
+        <w:t>).strip</w:t>
+      </w:r>
+      <w:proofErr w:type="gramEnd"/>
+      <w:r>
+        <w:rPr>
+          <w:rFonts w:ascii="Courier New" w:eastAsia="Courier New" w:hAnsi="Courier New" w:cs="Courier New"/>
+          <w:color w:val="1A1A2E"/>
+          <w:sz w:val="19"/>
+          <w:szCs w:val="19"/>
+        </w:rPr>
+        <w:t>(</w:t>
+      </w:r>
+      <w:proofErr w:type="gramStart"/>
+      <w:r>
+        <w:rPr>
+          <w:rFonts w:ascii="Courier New" w:eastAsia="Courier New" w:hAnsi="Courier New" w:cs="Courier New"/>
+          <w:color w:val="1A1A2E"/>
+          <w:sz w:val="19"/>
+          <w:szCs w:val="19"/>
+        </w:rPr>
+        <w:t>).upper</w:t>
+      </w:r>
+      <w:proofErr w:type="gramEnd"/>
+      <w:r>
+        <w:rPr>
+          <w:rFonts w:ascii="Courier New" w:eastAsia="Courier New" w:hAnsi="Courier New" w:cs="Courier New"/>
+          <w:color w:val="1A1A2E"/>
+          <w:sz w:val="19"/>
+          <w:szCs w:val="19"/>
+        </w:rPr>
+        <w:t>()</w:t>
       </w:r>
     </w:p>
     <w:p>
@@ -684,23 +1036,44 @@
           <w:sz w:val="19"/>
           <w:szCs w:val="19"/>
         </w:rPr>
-        <w:t xml:space="preserve">        print(" Thank you for using the Sitka Weather Viewer. Goodbye! ")</w:t>
-      </w:r>
-    </w:p>
-    <w:p>
-      <w:pPr>
-        <w:shd w:val="clear" w:color="auto" w:fill="F2F2F2"/>
-      </w:pPr>
-      <w:r>
-        <w:rPr>
-          <w:rFonts w:ascii="Courier New" w:eastAsia="Courier New" w:hAnsi="Courier New" w:cs="Courier New"/>
-          <w:color w:val="1A1A2E"/>
-          <w:sz w:val="19"/>
-          <w:szCs w:val="19"/>
-        </w:rPr>
         <w:t xml:space="preserve">        </w:t>
       </w:r>
+      <w:proofErr w:type="gramStart"/>
+      <w:r>
+        <w:rPr>
+          <w:rFonts w:ascii="Courier New" w:eastAsia="Courier New" w:hAnsi="Courier New" w:cs="Courier New"/>
+          <w:color w:val="1A1A2E"/>
+          <w:sz w:val="19"/>
+          <w:szCs w:val="19"/>
+        </w:rPr>
+        <w:t>print(</w:t>
+      </w:r>
+      <w:proofErr w:type="gramEnd"/>
+      <w:r>
+        <w:rPr>
+          <w:rFonts w:ascii="Courier New" w:eastAsia="Courier New" w:hAnsi="Courier New" w:cs="Courier New"/>
+          <w:color w:val="1A1A2E"/>
+          <w:sz w:val="19"/>
+          <w:szCs w:val="19"/>
+        </w:rPr>
+        <w:t>" Thank you for using the Sitka Weather Viewer. Goodbye! ")</w:t>
+      </w:r>
+    </w:p>
+    <w:p>
+      <w:pPr>
+        <w:shd w:val="clear" w:color="auto" w:fill="F2F2F2"/>
+      </w:pPr>
+      <w:r>
+        <w:rPr>
+          <w:rFonts w:ascii="Courier New" w:eastAsia="Courier New" w:hAnsi="Courier New" w:cs="Courier New"/>
+          <w:color w:val="1A1A2E"/>
+          <w:sz w:val="19"/>
+          <w:szCs w:val="19"/>
+        </w:rPr>
+        <w:t xml:space="preserve">        </w:t>
+      </w:r>
       <w:proofErr w:type="spellStart"/>
+      <w:proofErr w:type="gramStart"/>
       <w:r>
         <w:rPr>
           <w:rFonts w:ascii="Courier New" w:eastAsia="Courier New" w:hAnsi="Courier New" w:cs="Courier New"/>
@@ -711,6 +1084,7 @@
         <w:t>sys.exit</w:t>
       </w:r>
       <w:proofErr w:type="spellEnd"/>
+      <w:proofErr w:type="gramEnd"/>
       <w:r>
         <w:rPr>
           <w:rFonts w:ascii="Courier New" w:eastAsia="Courier New" w:hAnsi="Courier New" w:cs="Courier New"/>
@@ -785,7 +1159,27 @@
           <w:sz w:val="19"/>
           <w:szCs w:val="19"/>
         </w:rPr>
-        <w:t xml:space="preserve">        with open(FILENAME) as f:</w:t>
+        <w:t xml:space="preserve">        with </w:t>
+      </w:r>
+      <w:proofErr w:type="gramStart"/>
+      <w:r>
+        <w:rPr>
+          <w:rFonts w:ascii="Courier New" w:eastAsia="Courier New" w:hAnsi="Courier New" w:cs="Courier New"/>
+          <w:color w:val="1A1A2E"/>
+          <w:sz w:val="19"/>
+          <w:szCs w:val="19"/>
+        </w:rPr>
+        <w:t>open(</w:t>
+      </w:r>
+      <w:proofErr w:type="gramEnd"/>
+      <w:r>
+        <w:rPr>
+          <w:rFonts w:ascii="Courier New" w:eastAsia="Courier New" w:hAnsi="Courier New" w:cs="Courier New"/>
+          <w:color w:val="1A1A2E"/>
+          <w:sz w:val="19"/>
+          <w:szCs w:val="19"/>
+        </w:rPr>
+        <w:t>FILENAME) as f:</w:t>
       </w:r>
     </w:p>
     <w:p>
@@ -802,6 +1196,7 @@
         <w:t xml:space="preserve">            reader = </w:t>
       </w:r>
       <w:proofErr w:type="spellStart"/>
+      <w:proofErr w:type="gramStart"/>
       <w:r>
         <w:rPr>
           <w:rFonts w:ascii="Courier New" w:eastAsia="Courier New" w:hAnsi="Courier New" w:cs="Courier New"/>
@@ -812,6 +1207,7 @@
         <w:t>csv.reader</w:t>
       </w:r>
       <w:proofErr w:type="spellEnd"/>
+      <w:proofErr w:type="gramEnd"/>
       <w:r>
         <w:rPr>
           <w:rFonts w:ascii="Courier New" w:eastAsia="Courier New" w:hAnsi="Courier New" w:cs="Courier New"/>
@@ -864,6 +1260,7 @@
         <w:t xml:space="preserve">                </w:t>
       </w:r>
       <w:proofErr w:type="spellStart"/>
+      <w:proofErr w:type="gramStart"/>
       <w:r>
         <w:rPr>
           <w:rFonts w:ascii="Courier New" w:eastAsia="Courier New" w:hAnsi="Courier New" w:cs="Courier New"/>
@@ -874,6 +1271,7 @@
         <w:t>dates.append</w:t>
       </w:r>
       <w:proofErr w:type="spellEnd"/>
+      <w:proofErr w:type="gramEnd"/>
       <w:r>
         <w:rPr>
           <w:rFonts w:ascii="Courier New" w:eastAsia="Courier New" w:hAnsi="Courier New" w:cs="Courier New"/>
@@ -884,6 +1282,7 @@
         <w:t>(</w:t>
       </w:r>
       <w:proofErr w:type="spellStart"/>
+      <w:proofErr w:type="gramStart"/>
       <w:r>
         <w:rPr>
           <w:rFonts w:ascii="Courier New" w:eastAsia="Courier New" w:hAnsi="Courier New" w:cs="Courier New"/>
@@ -894,14 +1293,35 @@
         <w:t>datetime.strptime</w:t>
       </w:r>
       <w:proofErr w:type="spellEnd"/>
-      <w:r>
-        <w:rPr>
-          <w:rFonts w:ascii="Courier New" w:eastAsia="Courier New" w:hAnsi="Courier New" w:cs="Courier New"/>
-          <w:color w:val="1A1A2E"/>
-          <w:sz w:val="19"/>
-          <w:szCs w:val="19"/>
-        </w:rPr>
-        <w:t>(row[2], "%Y-%m-%d"))</w:t>
+      <w:proofErr w:type="gramEnd"/>
+      <w:r>
+        <w:rPr>
+          <w:rFonts w:ascii="Courier New" w:eastAsia="Courier New" w:hAnsi="Courier New" w:cs="Courier New"/>
+          <w:color w:val="1A1A2E"/>
+          <w:sz w:val="19"/>
+          <w:szCs w:val="19"/>
+        </w:rPr>
+        <w:t>(</w:t>
+      </w:r>
+      <w:proofErr w:type="gramStart"/>
+      <w:r>
+        <w:rPr>
+          <w:rFonts w:ascii="Courier New" w:eastAsia="Courier New" w:hAnsi="Courier New" w:cs="Courier New"/>
+          <w:color w:val="1A1A2E"/>
+          <w:sz w:val="19"/>
+          <w:szCs w:val="19"/>
+        </w:rPr>
+        <w:t>row[</w:t>
+      </w:r>
+      <w:proofErr w:type="gramEnd"/>
+      <w:r>
+        <w:rPr>
+          <w:rFonts w:ascii="Courier New" w:eastAsia="Courier New" w:hAnsi="Courier New" w:cs="Courier New"/>
+          <w:color w:val="1A1A2E"/>
+          <w:sz w:val="19"/>
+          <w:szCs w:val="19"/>
+        </w:rPr>
+        <w:t>2], "%Y-%m-%d"))</w:t>
       </w:r>
     </w:p>
     <w:p>
@@ -918,6 +1338,7 @@
         <w:t xml:space="preserve">                </w:t>
       </w:r>
       <w:proofErr w:type="spellStart"/>
+      <w:proofErr w:type="gramStart"/>
       <w:r>
         <w:rPr>
           <w:rFonts w:ascii="Courier New" w:eastAsia="Courier New" w:hAnsi="Courier New" w:cs="Courier New"/>
@@ -928,14 +1349,55 @@
         <w:t>values.append</w:t>
       </w:r>
       <w:proofErr w:type="spellEnd"/>
-      <w:r>
-        <w:rPr>
-          <w:rFonts w:ascii="Courier New" w:eastAsia="Courier New" w:hAnsi="Courier New" w:cs="Courier New"/>
-          <w:color w:val="1A1A2E"/>
-          <w:sz w:val="19"/>
-          <w:szCs w:val="19"/>
-        </w:rPr>
-        <w:t>(int(row[5] if choice == "H" else row[6]))</w:t>
+      <w:proofErr w:type="gramEnd"/>
+      <w:r>
+        <w:rPr>
+          <w:rFonts w:ascii="Courier New" w:eastAsia="Courier New" w:hAnsi="Courier New" w:cs="Courier New"/>
+          <w:color w:val="1A1A2E"/>
+          <w:sz w:val="19"/>
+          <w:szCs w:val="19"/>
+        </w:rPr>
+        <w:t>(int(</w:t>
+      </w:r>
+      <w:proofErr w:type="gramStart"/>
+      <w:r>
+        <w:rPr>
+          <w:rFonts w:ascii="Courier New" w:eastAsia="Courier New" w:hAnsi="Courier New" w:cs="Courier New"/>
+          <w:color w:val="1A1A2E"/>
+          <w:sz w:val="19"/>
+          <w:szCs w:val="19"/>
+        </w:rPr>
+        <w:t>row[</w:t>
+      </w:r>
+      <w:proofErr w:type="gramEnd"/>
+      <w:r>
+        <w:rPr>
+          <w:rFonts w:ascii="Courier New" w:eastAsia="Courier New" w:hAnsi="Courier New" w:cs="Courier New"/>
+          <w:color w:val="1A1A2E"/>
+          <w:sz w:val="19"/>
+          <w:szCs w:val="19"/>
+        </w:rPr>
+        <w:t xml:space="preserve">5] if choice == "H" else </w:t>
+      </w:r>
+      <w:proofErr w:type="gramStart"/>
+      <w:r>
+        <w:rPr>
+          <w:rFonts w:ascii="Courier New" w:eastAsia="Courier New" w:hAnsi="Courier New" w:cs="Courier New"/>
+          <w:color w:val="1A1A2E"/>
+          <w:sz w:val="19"/>
+          <w:szCs w:val="19"/>
+        </w:rPr>
+        <w:t>row[</w:t>
+      </w:r>
+      <w:proofErr w:type="gramEnd"/>
+      <w:r>
+        <w:rPr>
+          <w:rFonts w:ascii="Courier New" w:eastAsia="Courier New" w:hAnsi="Courier New" w:cs="Courier New"/>
+          <w:color w:val="1A1A2E"/>
+          <w:sz w:val="19"/>
+          <w:szCs w:val="19"/>
+        </w:rPr>
+        <w:t>6]))</w:t>
       </w:r>
     </w:p>
     <w:p>
@@ -957,6 +1419,7 @@
         <w:t xml:space="preserve">        fig, ax = </w:t>
       </w:r>
       <w:proofErr w:type="spellStart"/>
+      <w:proofErr w:type="gramStart"/>
       <w:r>
         <w:rPr>
           <w:rFonts w:ascii="Courier New" w:eastAsia="Courier New" w:hAnsi="Courier New" w:cs="Courier New"/>
@@ -967,6 +1430,7 @@
         <w:t>plt.subplots</w:t>
       </w:r>
       <w:proofErr w:type="spellEnd"/>
+      <w:proofErr w:type="gramEnd"/>
       <w:r>
         <w:rPr>
           <w:rFonts w:ascii="Courier New" w:eastAsia="Courier New" w:hAnsi="Courier New" w:cs="Courier New"/>
@@ -1005,6 +1469,7 @@
         <w:t xml:space="preserve">            </w:t>
       </w:r>
       <w:proofErr w:type="spellStart"/>
+      <w:proofErr w:type="gramStart"/>
       <w:r>
         <w:rPr>
           <w:rFonts w:ascii="Courier New" w:eastAsia="Courier New" w:hAnsi="Courier New" w:cs="Courier New"/>
@@ -1015,6 +1480,7 @@
         <w:t>ax.plot</w:t>
       </w:r>
       <w:proofErr w:type="spellEnd"/>
+      <w:proofErr w:type="gramEnd"/>
       <w:r>
         <w:rPr>
           <w:rFonts w:ascii="Courier New" w:eastAsia="Courier New" w:hAnsi="Courier New" w:cs="Courier New"/>
@@ -1039,6 +1505,7 @@
         <w:t xml:space="preserve">            </w:t>
       </w:r>
       <w:proofErr w:type="spellStart"/>
+      <w:proofErr w:type="gramStart"/>
       <w:r>
         <w:rPr>
           <w:rFonts w:ascii="Courier New" w:eastAsia="Courier New" w:hAnsi="Courier New" w:cs="Courier New"/>
@@ -1049,6 +1516,7 @@
         <w:t>plt.title</w:t>
       </w:r>
       <w:proofErr w:type="spellEnd"/>
+      <w:proofErr w:type="gramEnd"/>
       <w:r>
         <w:rPr>
           <w:rFonts w:ascii="Courier New" w:eastAsia="Courier New" w:hAnsi="Courier New" w:cs="Courier New"/>
@@ -1107,6 +1575,7 @@
         <w:t xml:space="preserve">            </w:t>
       </w:r>
       <w:proofErr w:type="spellStart"/>
+      <w:proofErr w:type="gramStart"/>
       <w:r>
         <w:rPr>
           <w:rFonts w:ascii="Courier New" w:eastAsia="Courier New" w:hAnsi="Courier New" w:cs="Courier New"/>
@@ -1117,6 +1586,7 @@
         <w:t>ax.plot</w:t>
       </w:r>
       <w:proofErr w:type="spellEnd"/>
+      <w:proofErr w:type="gramEnd"/>
       <w:r>
         <w:rPr>
           <w:rFonts w:ascii="Courier New" w:eastAsia="Courier New" w:hAnsi="Courier New" w:cs="Courier New"/>
@@ -1141,6 +1611,7 @@
         <w:t xml:space="preserve">            </w:t>
       </w:r>
       <w:proofErr w:type="spellStart"/>
+      <w:proofErr w:type="gramStart"/>
       <w:r>
         <w:rPr>
           <w:rFonts w:ascii="Courier New" w:eastAsia="Courier New" w:hAnsi="Courier New" w:cs="Courier New"/>
@@ -1151,6 +1622,7 @@
         <w:t>plt.title</w:t>
       </w:r>
       <w:proofErr w:type="spellEnd"/>
+      <w:proofErr w:type="gramEnd"/>
       <w:r>
         <w:rPr>
           <w:rFonts w:ascii="Courier New" w:eastAsia="Courier New" w:hAnsi="Courier New" w:cs="Courier New"/>
@@ -1200,6 +1672,7 @@
         <w:t xml:space="preserve">        </w:t>
       </w:r>
       <w:proofErr w:type="spellStart"/>
+      <w:proofErr w:type="gramStart"/>
       <w:r>
         <w:rPr>
           <w:rFonts w:ascii="Courier New" w:eastAsia="Courier New" w:hAnsi="Courier New" w:cs="Courier New"/>
@@ -1210,6 +1683,7 @@
         <w:t>plt.xlabel</w:t>
       </w:r>
       <w:proofErr w:type="spellEnd"/>
+      <w:proofErr w:type="gramEnd"/>
       <w:r>
         <w:rPr>
           <w:rFonts w:ascii="Courier New" w:eastAsia="Courier New" w:hAnsi="Courier New" w:cs="Courier New"/>
@@ -1254,14 +1728,35 @@
         <w:t xml:space="preserve">        </w:t>
       </w:r>
       <w:proofErr w:type="spellStart"/>
-      <w:r>
-        <w:rPr>
-          <w:rFonts w:ascii="Courier New" w:eastAsia="Courier New" w:hAnsi="Courier New" w:cs="Courier New"/>
-          <w:color w:val="1A1A2E"/>
-          <w:sz w:val="19"/>
-          <w:szCs w:val="19"/>
-        </w:rPr>
-        <w:t>fig.autofmt_xdate</w:t>
+      <w:proofErr w:type="gramStart"/>
+      <w:r>
+        <w:rPr>
+          <w:rFonts w:ascii="Courier New" w:eastAsia="Courier New" w:hAnsi="Courier New" w:cs="Courier New"/>
+          <w:color w:val="1A1A2E"/>
+          <w:sz w:val="19"/>
+          <w:szCs w:val="19"/>
+        </w:rPr>
+        <w:t>fig.autofmt</w:t>
+      </w:r>
+      <w:proofErr w:type="gramEnd"/>
+      <w:r>
+        <w:rPr>
+          <w:rFonts w:ascii="Courier New" w:eastAsia="Courier New" w:hAnsi="Courier New" w:cs="Courier New"/>
+          <w:color w:val="1A1A2E"/>
+          <w:sz w:val="19"/>
+          <w:szCs w:val="19"/>
+        </w:rPr>
+        <w:t>_</w:t>
+      </w:r>
+      <w:proofErr w:type="gramStart"/>
+      <w:r>
+        <w:rPr>
+          <w:rFonts w:ascii="Courier New" w:eastAsia="Courier New" w:hAnsi="Courier New" w:cs="Courier New"/>
+          <w:color w:val="1A1A2E"/>
+          <w:sz w:val="19"/>
+          <w:szCs w:val="19"/>
+        </w:rPr>
+        <w:t>xdate</w:t>
       </w:r>
       <w:proofErr w:type="spellEnd"/>
       <w:r>
@@ -1271,6 +1766,193 @@
           <w:sz w:val="19"/>
           <w:szCs w:val="19"/>
         </w:rPr>
+        <w:t>(</w:t>
+      </w:r>
+      <w:proofErr w:type="gramEnd"/>
+      <w:r>
+        <w:rPr>
+          <w:rFonts w:ascii="Courier New" w:eastAsia="Courier New" w:hAnsi="Courier New" w:cs="Courier New"/>
+          <w:color w:val="1A1A2E"/>
+          <w:sz w:val="19"/>
+          <w:szCs w:val="19"/>
+        </w:rPr>
+        <w:t>)</w:t>
+      </w:r>
+    </w:p>
+    <w:p>
+      <w:pPr>
+        <w:shd w:val="clear" w:color="auto" w:fill="F2F2F2"/>
+      </w:pPr>
+      <w:r>
+        <w:rPr>
+          <w:rFonts w:ascii="Courier New" w:eastAsia="Courier New" w:hAnsi="Courier New" w:cs="Courier New"/>
+          <w:color w:val="1A1A2E"/>
+          <w:sz w:val="19"/>
+          <w:szCs w:val="19"/>
+        </w:rPr>
+        <w:t xml:space="preserve">        </w:t>
+      </w:r>
+      <w:proofErr w:type="spellStart"/>
+      <w:proofErr w:type="gramStart"/>
+      <w:r>
+        <w:rPr>
+          <w:rFonts w:ascii="Courier New" w:eastAsia="Courier New" w:hAnsi="Courier New" w:cs="Courier New"/>
+          <w:color w:val="1A1A2E"/>
+          <w:sz w:val="19"/>
+          <w:szCs w:val="19"/>
+        </w:rPr>
+        <w:t>plt.ylabel</w:t>
+      </w:r>
+      <w:proofErr w:type="spellEnd"/>
+      <w:proofErr w:type="gramEnd"/>
+      <w:r>
+        <w:rPr>
+          <w:rFonts w:ascii="Courier New" w:eastAsia="Courier New" w:hAnsi="Courier New" w:cs="Courier New"/>
+          <w:color w:val="1A1A2E"/>
+          <w:sz w:val="19"/>
+          <w:szCs w:val="19"/>
+        </w:rPr>
+        <w:t xml:space="preserve">("Temperature (F)", </w:t>
+      </w:r>
+      <w:proofErr w:type="spellStart"/>
+      <w:r>
+        <w:rPr>
+          <w:rFonts w:ascii="Courier New" w:eastAsia="Courier New" w:hAnsi="Courier New" w:cs="Courier New"/>
+          <w:color w:val="1A1A2E"/>
+          <w:sz w:val="19"/>
+          <w:szCs w:val="19"/>
+        </w:rPr>
+        <w:t>fontsize</w:t>
+      </w:r>
+      <w:proofErr w:type="spellEnd"/>
+      <w:r>
+        <w:rPr>
+          <w:rFonts w:ascii="Courier New" w:eastAsia="Courier New" w:hAnsi="Courier New" w:cs="Courier New"/>
+          <w:color w:val="1A1A2E"/>
+          <w:sz w:val="19"/>
+          <w:szCs w:val="19"/>
+        </w:rPr>
+        <w:t>=16)</w:t>
+      </w:r>
+    </w:p>
+    <w:p>
+      <w:pPr>
+        <w:shd w:val="clear" w:color="auto" w:fill="F2F2F2"/>
+      </w:pPr>
+      <w:r>
+        <w:rPr>
+          <w:rFonts w:ascii="Courier New" w:eastAsia="Courier New" w:hAnsi="Courier New" w:cs="Courier New"/>
+          <w:color w:val="1A1A2E"/>
+          <w:sz w:val="19"/>
+          <w:szCs w:val="19"/>
+        </w:rPr>
+        <w:t xml:space="preserve">        </w:t>
+      </w:r>
+      <w:proofErr w:type="spellStart"/>
+      <w:proofErr w:type="gramStart"/>
+      <w:r>
+        <w:rPr>
+          <w:rFonts w:ascii="Courier New" w:eastAsia="Courier New" w:hAnsi="Courier New" w:cs="Courier New"/>
+          <w:color w:val="1A1A2E"/>
+          <w:sz w:val="19"/>
+          <w:szCs w:val="19"/>
+        </w:rPr>
+        <w:t>plt.tick</w:t>
+      </w:r>
+      <w:proofErr w:type="gramEnd"/>
+      <w:r>
+        <w:rPr>
+          <w:rFonts w:ascii="Courier New" w:eastAsia="Courier New" w:hAnsi="Courier New" w:cs="Courier New"/>
+          <w:color w:val="1A1A2E"/>
+          <w:sz w:val="19"/>
+          <w:szCs w:val="19"/>
+        </w:rPr>
+        <w:t>_</w:t>
+      </w:r>
+      <w:proofErr w:type="gramStart"/>
+      <w:r>
+        <w:rPr>
+          <w:rFonts w:ascii="Courier New" w:eastAsia="Courier New" w:hAnsi="Courier New" w:cs="Courier New"/>
+          <w:color w:val="1A1A2E"/>
+          <w:sz w:val="19"/>
+          <w:szCs w:val="19"/>
+        </w:rPr>
+        <w:t>params</w:t>
+      </w:r>
+      <w:proofErr w:type="spellEnd"/>
+      <w:r>
+        <w:rPr>
+          <w:rFonts w:ascii="Courier New" w:eastAsia="Courier New" w:hAnsi="Courier New" w:cs="Courier New"/>
+          <w:color w:val="1A1A2E"/>
+          <w:sz w:val="19"/>
+          <w:szCs w:val="19"/>
+        </w:rPr>
+        <w:t>(</w:t>
+      </w:r>
+      <w:proofErr w:type="gramEnd"/>
+      <w:r>
+        <w:rPr>
+          <w:rFonts w:ascii="Courier New" w:eastAsia="Courier New" w:hAnsi="Courier New" w:cs="Courier New"/>
+          <w:color w:val="1A1A2E"/>
+          <w:sz w:val="19"/>
+          <w:szCs w:val="19"/>
+        </w:rPr>
+        <w:t xml:space="preserve">axis="both", which="major", </w:t>
+      </w:r>
+      <w:proofErr w:type="spellStart"/>
+      <w:r>
+        <w:rPr>
+          <w:rFonts w:ascii="Courier New" w:eastAsia="Courier New" w:hAnsi="Courier New" w:cs="Courier New"/>
+          <w:color w:val="1A1A2E"/>
+          <w:sz w:val="19"/>
+          <w:szCs w:val="19"/>
+        </w:rPr>
+        <w:t>labelsize</w:t>
+      </w:r>
+      <w:proofErr w:type="spellEnd"/>
+      <w:r>
+        <w:rPr>
+          <w:rFonts w:ascii="Courier New" w:eastAsia="Courier New" w:hAnsi="Courier New" w:cs="Courier New"/>
+          <w:color w:val="1A1A2E"/>
+          <w:sz w:val="19"/>
+          <w:szCs w:val="19"/>
+        </w:rPr>
+        <w:t>=16)</w:t>
+      </w:r>
+    </w:p>
+    <w:p>
+      <w:pPr>
+        <w:shd w:val="clear" w:color="auto" w:fill="F2F2F2"/>
+      </w:pPr>
+      <w:r>
+        <w:rPr>
+          <w:rFonts w:ascii="Courier New" w:eastAsia="Courier New" w:hAnsi="Courier New" w:cs="Courier New"/>
+          <w:color w:val="1A1A2E"/>
+          <w:sz w:val="19"/>
+          <w:szCs w:val="19"/>
+        </w:rPr>
+        <w:t xml:space="preserve">        </w:t>
+      </w:r>
+      <w:proofErr w:type="spellStart"/>
+      <w:proofErr w:type="gramStart"/>
+      <w:r>
+        <w:rPr>
+          <w:rFonts w:ascii="Courier New" w:eastAsia="Courier New" w:hAnsi="Courier New" w:cs="Courier New"/>
+          <w:color w:val="1A1A2E"/>
+          <w:sz w:val="19"/>
+          <w:szCs w:val="19"/>
+        </w:rPr>
+        <w:t>plt.show</w:t>
+      </w:r>
+      <w:proofErr w:type="spellEnd"/>
+      <w:proofErr w:type="gramEnd"/>
+      <w:r>
+        <w:rPr>
+          <w:rFonts w:ascii="Courier New" w:eastAsia="Courier New" w:hAnsi="Courier New" w:cs="Courier New"/>
+          <w:color w:val="1A1A2E"/>
+          <w:sz w:val="19"/>
+          <w:szCs w:val="19"/>
+        </w:rPr>
         <w:t>()</w:t>
       </w:r>
     </w:p>
@@ -1278,6 +1960,25 @@
       <w:pPr>
         <w:shd w:val="clear" w:color="auto" w:fill="F2F2F2"/>
       </w:pPr>
+    </w:p>
+    <w:p>
+      <w:pPr>
+        <w:shd w:val="clear" w:color="auto" w:fill="F2F2F2"/>
+      </w:pPr>
+      <w:r>
+        <w:rPr>
+          <w:rFonts w:ascii="Courier New" w:eastAsia="Courier New" w:hAnsi="Courier New" w:cs="Courier New"/>
+          <w:color w:val="1A1A2E"/>
+          <w:sz w:val="19"/>
+          <w:szCs w:val="19"/>
+        </w:rPr>
+        <w:t xml:space="preserve">    else:</w:t>
+      </w:r>
+    </w:p>
+    <w:p>
+      <w:pPr>
+        <w:shd w:val="clear" w:color="auto" w:fill="F2F2F2"/>
+      </w:pPr>
       <w:r>
         <w:rPr>
           <w:rFonts w:ascii="Courier New" w:eastAsia="Courier New" w:hAnsi="Courier New" w:cs="Courier New"/>
@@ -1287,166 +1988,65 @@
         </w:rPr>
         <w:t xml:space="preserve">        </w:t>
       </w:r>
-      <w:proofErr w:type="spellStart"/>
-      <w:r>
-        <w:rPr>
-          <w:rFonts w:ascii="Courier New" w:eastAsia="Courier New" w:hAnsi="Courier New" w:cs="Courier New"/>
-          <w:color w:val="1A1A2E"/>
-          <w:sz w:val="19"/>
-          <w:szCs w:val="19"/>
-        </w:rPr>
-        <w:t>plt.ylabel</w:t>
-      </w:r>
-      <w:proofErr w:type="spellEnd"/>
-      <w:r>
-        <w:rPr>
-          <w:rFonts w:ascii="Courier New" w:eastAsia="Courier New" w:hAnsi="Courier New" w:cs="Courier New"/>
-          <w:color w:val="1A1A2E"/>
-          <w:sz w:val="19"/>
-          <w:szCs w:val="19"/>
-        </w:rPr>
-        <w:t xml:space="preserve">("Temperature (F)", </w:t>
-      </w:r>
-      <w:proofErr w:type="spellStart"/>
-      <w:r>
-        <w:rPr>
-          <w:rFonts w:ascii="Courier New" w:eastAsia="Courier New" w:hAnsi="Courier New" w:cs="Courier New"/>
-          <w:color w:val="1A1A2E"/>
-          <w:sz w:val="19"/>
-          <w:szCs w:val="19"/>
-        </w:rPr>
-        <w:t>fontsize</w:t>
-      </w:r>
-      <w:proofErr w:type="spellEnd"/>
-      <w:r>
-        <w:rPr>
-          <w:rFonts w:ascii="Courier New" w:eastAsia="Courier New" w:hAnsi="Courier New" w:cs="Courier New"/>
-          <w:color w:val="1A1A2E"/>
-          <w:sz w:val="19"/>
-          <w:szCs w:val="19"/>
-        </w:rPr>
-        <w:t>=16)</w:t>
-      </w:r>
-    </w:p>
-    <w:p>
-      <w:pPr>
-        <w:shd w:val="clear" w:color="auto" w:fill="F2F2F2"/>
-      </w:pPr>
-      <w:r>
-        <w:rPr>
-          <w:rFonts w:ascii="Courier New" w:eastAsia="Courier New" w:hAnsi="Courier New" w:cs="Courier New"/>
-          <w:color w:val="1A1A2E"/>
-          <w:sz w:val="19"/>
-          <w:szCs w:val="19"/>
-        </w:rPr>
-        <w:t xml:space="preserve">        </w:t>
-      </w:r>
-      <w:proofErr w:type="spellStart"/>
-      <w:r>
-        <w:rPr>
-          <w:rFonts w:ascii="Courier New" w:eastAsia="Courier New" w:hAnsi="Courier New" w:cs="Courier New"/>
-          <w:color w:val="1A1A2E"/>
-          <w:sz w:val="19"/>
-          <w:szCs w:val="19"/>
-        </w:rPr>
-        <w:t>plt.tick_params</w:t>
-      </w:r>
-      <w:proofErr w:type="spellEnd"/>
-      <w:r>
-        <w:rPr>
-          <w:rFonts w:ascii="Courier New" w:eastAsia="Courier New" w:hAnsi="Courier New" w:cs="Courier New"/>
-          <w:color w:val="1A1A2E"/>
-          <w:sz w:val="19"/>
-          <w:szCs w:val="19"/>
-        </w:rPr>
-        <w:t xml:space="preserve">(axis="both", which="major", </w:t>
-      </w:r>
-      <w:proofErr w:type="spellStart"/>
-      <w:r>
-        <w:rPr>
-          <w:rFonts w:ascii="Courier New" w:eastAsia="Courier New" w:hAnsi="Courier New" w:cs="Courier New"/>
-          <w:color w:val="1A1A2E"/>
-          <w:sz w:val="19"/>
-          <w:szCs w:val="19"/>
-        </w:rPr>
-        <w:t>labelsize</w:t>
-      </w:r>
-      <w:proofErr w:type="spellEnd"/>
-      <w:r>
-        <w:rPr>
-          <w:rFonts w:ascii="Courier New" w:eastAsia="Courier New" w:hAnsi="Courier New" w:cs="Courier New"/>
-          <w:color w:val="1A1A2E"/>
-          <w:sz w:val="19"/>
-          <w:szCs w:val="19"/>
-        </w:rPr>
-        <w:t>=16)</w:t>
-      </w:r>
-    </w:p>
-    <w:p>
-      <w:pPr>
-        <w:shd w:val="clear" w:color="auto" w:fill="F2F2F2"/>
-      </w:pPr>
-      <w:r>
-        <w:rPr>
-          <w:rFonts w:ascii="Courier New" w:eastAsia="Courier New" w:hAnsi="Courier New" w:cs="Courier New"/>
-          <w:color w:val="1A1A2E"/>
-          <w:sz w:val="19"/>
-          <w:szCs w:val="19"/>
-        </w:rPr>
-        <w:t xml:space="preserve">        </w:t>
-      </w:r>
-      <w:proofErr w:type="spellStart"/>
-      <w:r>
-        <w:rPr>
-          <w:rFonts w:ascii="Courier New" w:eastAsia="Courier New" w:hAnsi="Courier New" w:cs="Courier New"/>
-          <w:color w:val="1A1A2E"/>
-          <w:sz w:val="19"/>
-          <w:szCs w:val="19"/>
-        </w:rPr>
-        <w:t>plt.show</w:t>
-      </w:r>
-      <w:proofErr w:type="spellEnd"/>
-      <w:r>
-        <w:rPr>
-          <w:rFonts w:ascii="Courier New" w:eastAsia="Courier New" w:hAnsi="Courier New" w:cs="Courier New"/>
-          <w:color w:val="1A1A2E"/>
-          <w:sz w:val="19"/>
-          <w:szCs w:val="19"/>
-        </w:rPr>
-        <w:t>()</w:t>
-      </w:r>
-    </w:p>
-    <w:p>
-      <w:pPr>
-        <w:shd w:val="clear" w:color="auto" w:fill="F2F2F2"/>
-      </w:pPr>
-    </w:p>
-    <w:p>
-      <w:pPr>
-        <w:shd w:val="clear" w:color="auto" w:fill="F2F2F2"/>
-      </w:pPr>
-      <w:r>
-        <w:rPr>
-          <w:rFonts w:ascii="Courier New" w:eastAsia="Courier New" w:hAnsi="Courier New" w:cs="Courier New"/>
-          <w:color w:val="1A1A2E"/>
-          <w:sz w:val="19"/>
-          <w:szCs w:val="19"/>
-        </w:rPr>
-        <w:t xml:space="preserve">    else:</w:t>
-      </w:r>
-    </w:p>
-    <w:p>
-      <w:pPr>
-        <w:shd w:val="clear" w:color="auto" w:fill="F2F2F2"/>
-      </w:pPr>
-      <w:r>
-        <w:rPr>
-          <w:rFonts w:ascii="Courier New" w:eastAsia="Courier New" w:hAnsi="Courier New" w:cs="Courier New"/>
-          <w:color w:val="1A1A2E"/>
-          <w:sz w:val="19"/>
-          <w:szCs w:val="19"/>
-        </w:rPr>
-        <w:t xml:space="preserve">        print(f"  '{choice}' is not valid. Please enter H, L, or E.")</w:t>
+      <w:proofErr w:type="gramStart"/>
+      <w:r>
+        <w:rPr>
+          <w:rFonts w:ascii="Courier New" w:eastAsia="Courier New" w:hAnsi="Courier New" w:cs="Courier New"/>
+          <w:color w:val="1A1A2E"/>
+          <w:sz w:val="19"/>
+          <w:szCs w:val="19"/>
+        </w:rPr>
+        <w:t>print(</w:t>
+      </w:r>
+      <w:proofErr w:type="gramEnd"/>
+      <w:r>
+        <w:rPr>
+          <w:rFonts w:ascii="Courier New" w:eastAsia="Courier New" w:hAnsi="Courier New" w:cs="Courier New"/>
+          <w:color w:val="1A1A2E"/>
+          <w:sz w:val="19"/>
+          <w:szCs w:val="19"/>
+        </w:rPr>
+        <w:t>f</w:t>
+      </w:r>
+      <w:proofErr w:type="gramStart"/>
+      <w:r>
+        <w:rPr>
+          <w:rFonts w:ascii="Courier New" w:eastAsia="Courier New" w:hAnsi="Courier New" w:cs="Courier New"/>
+          <w:color w:val="1A1A2E"/>
+          <w:sz w:val="19"/>
+          <w:szCs w:val="19"/>
+        </w:rPr>
+        <w:t>"  '</w:t>
+      </w:r>
+      <w:proofErr w:type="gramEnd"/>
+      <w:r>
+        <w:rPr>
+          <w:rFonts w:ascii="Courier New" w:eastAsia="Courier New" w:hAnsi="Courier New" w:cs="Courier New"/>
+          <w:color w:val="1A1A2E"/>
+          <w:sz w:val="19"/>
+          <w:szCs w:val="19"/>
+        </w:rPr>
+        <w:t>{</w:t>
+      </w:r>
+      <w:proofErr w:type="gramStart"/>
+      <w:r>
+        <w:rPr>
+          <w:rFonts w:ascii="Courier New" w:eastAsia="Courier New" w:hAnsi="Courier New" w:cs="Courier New"/>
+          <w:color w:val="1A1A2E"/>
+          <w:sz w:val="19"/>
+          <w:szCs w:val="19"/>
+        </w:rPr>
+        <w:t>choice}'</w:t>
+      </w:r>
+      <w:proofErr w:type="gramEnd"/>
+      <w:r>
+        <w:rPr>
+          <w:rFonts w:ascii="Courier New" w:eastAsia="Courier New" w:hAnsi="Courier New" w:cs="Courier New"/>
+          <w:color w:val="1A1A2E"/>
+          <w:sz w:val="19"/>
+          <w:szCs w:val="19"/>
+        </w:rPr>
+        <w:t xml:space="preserve"> is not valid. Please enter H, L, or E.")</w:t>
       </w:r>
     </w:p>
     <w:p/>
@@ -1481,10 +2081,12 @@
         <w:t xml:space="preserve">The flowchart below reflects all changes: the menu loop, Highs vs. Lows branches, and the Exit path with </w:t>
       </w:r>
       <w:proofErr w:type="spellStart"/>
+      <w:proofErr w:type="gramStart"/>
       <w:r>
         <w:t>sys.exit</w:t>
       </w:r>
       <w:proofErr w:type="spellEnd"/>
+      <w:proofErr w:type="gramEnd"/>
       <w:r>
         <w:t>().</w:t>
       </w:r>
@@ -1559,6 +2161,7 @@
         </w:rPr>
         <w:t xml:space="preserve">End of Module 4 Assignment </w:t>
       </w:r>
+      <w:proofErr w:type="gramStart"/>
       <w:r>
         <w:rPr>
           <w:i/>
@@ -1577,7 +2180,40 @@
           <w:sz w:val="18"/>
           <w:szCs w:val="18"/>
         </w:rPr>
-        <w:t xml:space="preserve">  Zachary White  |  CSD 325</w:t>
+        <w:t xml:space="preserve">  Zachary</w:t>
+      </w:r>
+      <w:proofErr w:type="gramEnd"/>
+      <w:r>
+        <w:rPr>
+          <w:i/>
+          <w:iCs/>
+          <w:color w:val="888888"/>
+          <w:sz w:val="18"/>
+          <w:szCs w:val="18"/>
+        </w:rPr>
+        <w:t xml:space="preserve"> </w:t>
+      </w:r>
+      <w:proofErr w:type="gramStart"/>
+      <w:r>
+        <w:rPr>
+          <w:i/>
+          <w:iCs/>
+          <w:color w:val="888888"/>
+          <w:sz w:val="18"/>
+          <w:szCs w:val="18"/>
+        </w:rPr>
+        <w:t>White  |</w:t>
+      </w:r>
+      <w:proofErr w:type="gramEnd"/>
+      <w:r>
+        <w:rPr>
+          <w:i/>
+          <w:iCs/>
+          <w:color w:val="888888"/>
+          <w:sz w:val="18"/>
+          <w:szCs w:val="18"/>
+        </w:rPr>
+        <w:t xml:space="preserve">  CSD 325</w:t>
       </w:r>
     </w:p>
     <w:sectPr>

</xml_diff>